<commit_message>
update documentation & upload Project Report .pdf file
</commit_message>
<xml_diff>
--- a/Unit_5_First_Term_Projects/Project1_Pressure_Detection/Sys_ARCH_Model/Project_1_Report.docx
+++ b/Unit_5_First_Term_Projects/Project1_Pressure_Detection/Sys_ARCH_Model/Project_1_Report.docx
@@ -1,6 +1,6 @@
 
 <file path=word/document.xml><?xml version="1.0" encoding="utf-8"?>
-<w:document xmlns:wpc="http://schemas.microsoft.com/office/word/2010/wordprocessingCanvas" xmlns:cx="http://schemas.microsoft.com/office/drawing/2014/chartex" xmlns:cx1="http://schemas.microsoft.com/office/drawing/2015/9/8/chartex" xmlns:cx2="http://schemas.microsoft.com/office/drawing/2015/10/21/chartex" xmlns:cx3="http://schemas.microsoft.com/office/drawing/2016/5/9/chartex" xmlns:cx4="http://schemas.microsoft.com/office/drawing/2016/5/10/chartex" xmlns:cx5="http://schemas.microsoft.com/office/drawing/2016/5/11/chartex" xmlns:cx6="http://schemas.microsoft.com/office/drawing/2016/5/12/chartex" xmlns:cx7="http://schemas.microsoft.com/office/drawing/2016/5/13/chartex" xmlns:cx8="http://schemas.microsoft.com/office/drawing/2016/5/14/chartex" xmlns:mc="http://schemas.openxmlformats.org/markup-compatibility/2006" xmlns:aink="http://schemas.microsoft.com/office/drawing/2016/ink" xmlns:am3d="http://schemas.microsoft.com/office/drawing/2017/model3d" xmlns:o="urn:schemas-microsoft-com:office:office" xmlns:oel="http://schemas.microsoft.com/office/2019/extlst" xmlns:r="http://schemas.openxmlformats.org/officeDocument/2006/relationships" xmlns:m="http://schemas.openxmlformats.org/officeDocument/2006/math" xmlns:v="urn:schemas-microsoft-com:vml" xmlns:wp14="http://schemas.microsoft.com/office/word/2010/wordprocessingDrawing" xmlns:wp="http://schemas.openxmlformats.org/drawingml/2006/wordprocessingDrawing" xmlns:w10="urn:schemas-microsoft-com:office:word" xmlns:w="http://schemas.openxmlformats.org/wordprocessingml/2006/main" xmlns:w14="http://schemas.microsoft.com/office/word/2010/wordml" xmlns:w15="http://schemas.microsoft.com/office/word/2012/wordml" xmlns:w16cex="http://schemas.microsoft.com/office/word/2018/wordml/cex" xmlns:w16cid="http://schemas.microsoft.com/office/word/2016/wordml/cid" xmlns:w16="http://schemas.microsoft.com/office/word/2018/wordml" xmlns:w16sdtdh="http://schemas.microsoft.com/office/word/2020/wordml/sdtdatahash" xmlns:w16se="http://schemas.microsoft.com/office/word/2015/wordml/symex" xmlns:wpg="http://schemas.microsoft.com/office/word/2010/wordprocessingGroup" xmlns:wpi="http://schemas.microsoft.com/office/word/2010/wordprocessingInk" xmlns:wne="http://schemas.microsoft.com/office/word/2006/wordml" xmlns:wps="http://schemas.microsoft.com/office/word/2010/wordprocessingShape" mc:Ignorable="w14 w15 w16se w16cid w16 w16cex w16sdtdh wp14">
+<w:document xmlns:wpc="http://schemas.microsoft.com/office/word/2010/wordprocessingCanvas" xmlns:mc="http://schemas.openxmlformats.org/markup-compatibility/2006" xmlns:o="urn:schemas-microsoft-com:office:office" xmlns:r="http://schemas.openxmlformats.org/officeDocument/2006/relationships" xmlns:m="http://schemas.openxmlformats.org/officeDocument/2006/math" xmlns:v="urn:schemas-microsoft-com:vml" xmlns:wp14="http://schemas.microsoft.com/office/word/2010/wordprocessingDrawing" xmlns:wp="http://schemas.openxmlformats.org/drawingml/2006/wordprocessingDrawing" xmlns:w10="urn:schemas-microsoft-com:office:word" xmlns:w="http://schemas.openxmlformats.org/wordprocessingml/2006/main" xmlns:w14="http://schemas.microsoft.com/office/word/2010/wordml" xmlns:w15="http://schemas.microsoft.com/office/word/2012/wordml" xmlns:wpg="http://schemas.microsoft.com/office/word/2010/wordprocessingGroup" xmlns:wpi="http://schemas.microsoft.com/office/word/2010/wordprocessingInk" xmlns:wne="http://schemas.microsoft.com/office/word/2006/wordml" xmlns:wps="http://schemas.microsoft.com/office/word/2010/wordprocessingShape" mc:Ignorable="w14 w15 wp14">
   <w:body>
     <w:p>
       <w:pPr>
@@ -189,6 +189,12 @@
     </w:p>
     <w:sdt>
       <w:sdtPr>
+        <w:rPr>
+          <w:rFonts w:asciiTheme="minorHAnsi" w:eastAsiaTheme="minorHAnsi" w:hAnsiTheme="minorHAnsi" w:cstheme="minorBidi"/>
+          <w:color w:val="595959" w:themeColor="text1" w:themeTint="A6"/>
+          <w:sz w:val="22"/>
+          <w:szCs w:val="22"/>
+        </w:rPr>
         <w:id w:val="-1849396976"/>
         <w:docPartObj>
           <w:docPartGallery w:val="Table of Contents"/>
@@ -197,13 +203,9 @@
       </w:sdtPr>
       <w:sdtEndPr>
         <w:rPr>
-          <w:rFonts w:asciiTheme="minorHAnsi" w:eastAsiaTheme="minorHAnsi" w:hAnsiTheme="minorHAnsi" w:cstheme="minorBidi"/>
           <w:b/>
           <w:bCs/>
           <w:noProof/>
-          <w:color w:val="595959" w:themeColor="text1" w:themeTint="A6"/>
-          <w:sz w:val="22"/>
-          <w:szCs w:val="22"/>
         </w:rPr>
       </w:sdtEndPr>
       <w:sdtContent>
@@ -1415,8 +1417,16 @@
         <w:t>the measured values</w:t>
       </w:r>
       <w:r>
-        <w:t xml:space="preserve"> into some memory</w:t>
-      </w:r>
+        <w:t xml:space="preserve"> into </w:t>
+      </w:r>
+      <w:proofErr w:type="gramStart"/>
+      <w:r>
+        <w:t xml:space="preserve">the </w:t>
+      </w:r>
+      <w:r>
+        <w:t xml:space="preserve"> memory</w:t>
+      </w:r>
+      <w:proofErr w:type="gramEnd"/>
       <w:r>
         <w:t>.</w:t>
       </w:r>
@@ -1426,15 +1436,7 @@
     </w:p>
     <w:p>
       <w:r>
-        <w:t xml:space="preserve">For this use case a system </w:t>
-      </w:r>
-      <w:proofErr w:type="gramStart"/>
-      <w:r>
-        <w:t>has to</w:t>
-      </w:r>
-      <w:proofErr w:type="gramEnd"/>
-      <w:r>
-        <w:t xml:space="preserve"> be designed to fulfill this use case.  </w:t>
+        <w:t xml:space="preserve">For this use case a system has to be designed to fulfill this use case.  </w:t>
       </w:r>
       <w:r>
         <w:t xml:space="preserve"> </w:t>
@@ -1451,19 +1453,11 @@
           <w:u w:val="single"/>
         </w:rPr>
       </w:pPr>
-      <w:proofErr w:type="gramStart"/>
       <w:r>
         <w:rPr>
           <w:u w:val="single"/>
         </w:rPr>
-        <w:t>In order to</w:t>
-      </w:r>
-      <w:proofErr w:type="gramEnd"/>
-      <w:r>
-        <w:rPr>
-          <w:u w:val="single"/>
-        </w:rPr>
-        <w:t xml:space="preserve"> have a clear definition of the use case, these main assumptions have been taken into consideration: </w:t>
+        <w:t xml:space="preserve">In order to have a clear definition of the use case, these main assumptions have been taken into consideration: </w:t>
       </w:r>
     </w:p>
     <w:p>
@@ -1569,7 +1563,7 @@
         <w:t xml:space="preserve"> and management in way that is clear for all parties (customer &amp; supplier)</w:t>
       </w:r>
       <w:r>
-        <w:t xml:space="preserve">, and then moving forward to the next phases of documentations using Unified Modelling Language UML. This is used as common language, to illustrate the main aspects of the projects and till detailed design. Finally, simulations of the entire system have been performed that ensure the proper functionality of the entire software design. </w:t>
+        <w:t xml:space="preserve">, and then moving forward to the next phases of documentations using Unified Modelling Language UML. This is used as common language, to illustrate the main aspects of the projects till detailed design. Finally, simulations of the entire system have been performed that ensure the proper functionality of the entire software design. </w:t>
       </w:r>
     </w:p>
     <w:p>
@@ -2299,7 +2293,7 @@
         <w:t>documentation</w:t>
       </w:r>
       <w:r>
-        <w:t xml:space="preserve"> how to software would like, it was directly started with implementation of each software module as .c &amp; .h files. In the Git</w:t>
+        <w:t>, it was directly started with implementation of each software module as .c &amp; .h files. In the Git</w:t>
       </w:r>
       <w:r>
         <w:t>H</w:t>
@@ -2308,11 +2302,6 @@
         <w:t xml:space="preserve">ub project, one can find all related files along with startup &amp; linker scripts that are used to bring up the entire software on STM32 Controller. </w:t>
       </w:r>
     </w:p>
-    <w:p/>
-    <w:p/>
-    <w:p/>
-    <w:p/>
-    <w:p/>
     <w:p/>
     <w:p>
       <w:pPr>
@@ -2337,14 +2326,11 @@
     </w:p>
     <w:p>
       <w:r>
-        <w:rPr>
-          <w:noProof/>
-        </w:rPr>
         <w:drawing>
-          <wp:inline distT="0" distB="0" distL="0" distR="0" wp14:anchorId="385EDA87" wp14:editId="29F24B9B">
-            <wp:extent cx="5486400" cy="2414270"/>
+          <wp:inline distT="0" distB="0" distL="0" distR="0" wp14:anchorId="19403F1F" wp14:editId="50C2427B">
+            <wp:extent cx="4650572" cy="5024142"/>
             <wp:effectExtent l="0" t="0" r="0" b="5080"/>
-            <wp:docPr id="14" name="Picture 14"/>
+            <wp:docPr id="15" name="Picture 15"/>
             <wp:cNvGraphicFramePr>
               <a:graphicFrameLocks xmlns:a="http://schemas.openxmlformats.org/drawingml/2006/main" noChangeAspect="1"/>
             </wp:cNvGraphicFramePr>
@@ -2364,7 +2350,7 @@
                   <pic:spPr>
                     <a:xfrm>
                       <a:off x="0" y="0"/>
-                      <a:ext cx="5486400" cy="2414270"/>
+                      <a:ext cx="4650572" cy="5024142"/>
                     </a:xfrm>
                     <a:prstGeom prst="rect">
                       <a:avLst/>
@@ -2379,13 +2365,13 @@
     </w:p>
     <w:p/>
     <w:p/>
-    <w:p/>
-    <w:p/>
     <w:p>
       <w:pPr>
         <w:pStyle w:val="Heading1"/>
       </w:pPr>
       <w:bookmarkStart w:id="18" w:name="_Toc173861352"/>
+      <w:bookmarkStart w:id="19" w:name="_GoBack"/>
+      <w:bookmarkEnd w:id="19"/>
       <w:r>
         <w:lastRenderedPageBreak/>
         <w:t>System Verification with Proteus Simulation</w:t>
@@ -2556,7 +2542,7 @@
 </file>
 
 <file path=word/endnotes.xml><?xml version="1.0" encoding="utf-8"?>
-<w:endnotes xmlns:wpc="http://schemas.microsoft.com/office/word/2010/wordprocessingCanvas" xmlns:cx="http://schemas.microsoft.com/office/drawing/2014/chartex" xmlns:cx1="http://schemas.microsoft.com/office/drawing/2015/9/8/chartex" xmlns:cx2="http://schemas.microsoft.com/office/drawing/2015/10/21/chartex" xmlns:cx3="http://schemas.microsoft.com/office/drawing/2016/5/9/chartex" xmlns:cx4="http://schemas.microsoft.com/office/drawing/2016/5/10/chartex" xmlns:cx5="http://schemas.microsoft.com/office/drawing/2016/5/11/chartex" xmlns:cx6="http://schemas.microsoft.com/office/drawing/2016/5/12/chartex" xmlns:cx7="http://schemas.microsoft.com/office/drawing/2016/5/13/chartex" xmlns:cx8="http://schemas.microsoft.com/office/drawing/2016/5/14/chartex" xmlns:mc="http://schemas.openxmlformats.org/markup-compatibility/2006" xmlns:aink="http://schemas.microsoft.com/office/drawing/2016/ink" xmlns:am3d="http://schemas.microsoft.com/office/drawing/2017/model3d" xmlns:o="urn:schemas-microsoft-com:office:office" xmlns:oel="http://schemas.microsoft.com/office/2019/extlst" xmlns:r="http://schemas.openxmlformats.org/officeDocument/2006/relationships" xmlns:m="http://schemas.openxmlformats.org/officeDocument/2006/math" xmlns:v="urn:schemas-microsoft-com:vml" xmlns:wp14="http://schemas.microsoft.com/office/word/2010/wordprocessingDrawing" xmlns:wp="http://schemas.openxmlformats.org/drawingml/2006/wordprocessingDrawing" xmlns:w10="urn:schemas-microsoft-com:office:word" xmlns:w="http://schemas.openxmlformats.org/wordprocessingml/2006/main" xmlns:w14="http://schemas.microsoft.com/office/word/2010/wordml" xmlns:w15="http://schemas.microsoft.com/office/word/2012/wordml" xmlns:w16cex="http://schemas.microsoft.com/office/word/2018/wordml/cex" xmlns:w16cid="http://schemas.microsoft.com/office/word/2016/wordml/cid" xmlns:w16="http://schemas.microsoft.com/office/word/2018/wordml" xmlns:w16sdtdh="http://schemas.microsoft.com/office/word/2020/wordml/sdtdatahash" xmlns:w16se="http://schemas.microsoft.com/office/word/2015/wordml/symex" xmlns:wpg="http://schemas.microsoft.com/office/word/2010/wordprocessingGroup" xmlns:wpi="http://schemas.microsoft.com/office/word/2010/wordprocessingInk" xmlns:wne="http://schemas.microsoft.com/office/word/2006/wordml" xmlns:wps="http://schemas.microsoft.com/office/word/2010/wordprocessingShape" mc:Ignorable="w14 w15 w16se w16cid w16 w16cex w16sdtdh wp14">
+<w:endnotes xmlns:wpc="http://schemas.microsoft.com/office/word/2010/wordprocessingCanvas" xmlns:mc="http://schemas.openxmlformats.org/markup-compatibility/2006" xmlns:o="urn:schemas-microsoft-com:office:office" xmlns:r="http://schemas.openxmlformats.org/officeDocument/2006/relationships" xmlns:m="http://schemas.openxmlformats.org/officeDocument/2006/math" xmlns:v="urn:schemas-microsoft-com:vml" xmlns:wp14="http://schemas.microsoft.com/office/word/2010/wordprocessingDrawing" xmlns:wp="http://schemas.openxmlformats.org/drawingml/2006/wordprocessingDrawing" xmlns:w10="urn:schemas-microsoft-com:office:word" xmlns:w="http://schemas.openxmlformats.org/wordprocessingml/2006/main" xmlns:w14="http://schemas.microsoft.com/office/word/2010/wordml" xmlns:w15="http://schemas.microsoft.com/office/word/2012/wordml" xmlns:wpg="http://schemas.microsoft.com/office/word/2010/wordprocessingGroup" xmlns:wpi="http://schemas.microsoft.com/office/word/2010/wordprocessingInk" xmlns:wne="http://schemas.microsoft.com/office/word/2006/wordml" xmlns:wps="http://schemas.microsoft.com/office/word/2010/wordprocessingShape" mc:Ignorable="w14 w15 wp14">
   <w:endnote w:type="separator" w:id="-1">
     <w:p>
       <w:pPr>
@@ -2581,7 +2567,7 @@
 </file>
 
 <file path=word/footer1.xml><?xml version="1.0" encoding="utf-8"?>
-<w:ftr xmlns:wpc="http://schemas.microsoft.com/office/word/2010/wordprocessingCanvas" xmlns:cx="http://schemas.microsoft.com/office/drawing/2014/chartex" xmlns:cx1="http://schemas.microsoft.com/office/drawing/2015/9/8/chartex" xmlns:cx2="http://schemas.microsoft.com/office/drawing/2015/10/21/chartex" xmlns:cx3="http://schemas.microsoft.com/office/drawing/2016/5/9/chartex" xmlns:cx4="http://schemas.microsoft.com/office/drawing/2016/5/10/chartex" xmlns:cx5="http://schemas.microsoft.com/office/drawing/2016/5/11/chartex" xmlns:cx6="http://schemas.microsoft.com/office/drawing/2016/5/12/chartex" xmlns:cx7="http://schemas.microsoft.com/office/drawing/2016/5/13/chartex" xmlns:cx8="http://schemas.microsoft.com/office/drawing/2016/5/14/chartex" xmlns:mc="http://schemas.openxmlformats.org/markup-compatibility/2006" xmlns:aink="http://schemas.microsoft.com/office/drawing/2016/ink" xmlns:am3d="http://schemas.microsoft.com/office/drawing/2017/model3d" xmlns:o="urn:schemas-microsoft-com:office:office" xmlns:oel="http://schemas.microsoft.com/office/2019/extlst" xmlns:r="http://schemas.openxmlformats.org/officeDocument/2006/relationships" xmlns:m="http://schemas.openxmlformats.org/officeDocument/2006/math" xmlns:v="urn:schemas-microsoft-com:vml" xmlns:wp14="http://schemas.microsoft.com/office/word/2010/wordprocessingDrawing" xmlns:wp="http://schemas.openxmlformats.org/drawingml/2006/wordprocessingDrawing" xmlns:w10="urn:schemas-microsoft-com:office:word" xmlns:w="http://schemas.openxmlformats.org/wordprocessingml/2006/main" xmlns:w14="http://schemas.microsoft.com/office/word/2010/wordml" xmlns:w15="http://schemas.microsoft.com/office/word/2012/wordml" xmlns:w16cex="http://schemas.microsoft.com/office/word/2018/wordml/cex" xmlns:w16cid="http://schemas.microsoft.com/office/word/2016/wordml/cid" xmlns:w16="http://schemas.microsoft.com/office/word/2018/wordml" xmlns:w16sdtdh="http://schemas.microsoft.com/office/word/2020/wordml/sdtdatahash" xmlns:w16se="http://schemas.microsoft.com/office/word/2015/wordml/symex" xmlns:wpg="http://schemas.microsoft.com/office/word/2010/wordprocessingGroup" xmlns:wpi="http://schemas.microsoft.com/office/word/2010/wordprocessingInk" xmlns:wne="http://schemas.microsoft.com/office/word/2006/wordml" xmlns:wps="http://schemas.microsoft.com/office/word/2010/wordprocessingShape" mc:Ignorable="w14 w15 w16se w16cid w16 w16cex w16sdtdh wp14">
+<w:ftr xmlns:wpc="http://schemas.microsoft.com/office/word/2010/wordprocessingCanvas" xmlns:mc="http://schemas.openxmlformats.org/markup-compatibility/2006" xmlns:o="urn:schemas-microsoft-com:office:office" xmlns:r="http://schemas.openxmlformats.org/officeDocument/2006/relationships" xmlns:m="http://schemas.openxmlformats.org/officeDocument/2006/math" xmlns:v="urn:schemas-microsoft-com:vml" xmlns:wp14="http://schemas.microsoft.com/office/word/2010/wordprocessingDrawing" xmlns:wp="http://schemas.openxmlformats.org/drawingml/2006/wordprocessingDrawing" xmlns:w10="urn:schemas-microsoft-com:office:word" xmlns:w="http://schemas.openxmlformats.org/wordprocessingml/2006/main" xmlns:w14="http://schemas.microsoft.com/office/word/2010/wordml" xmlns:w15="http://schemas.microsoft.com/office/word/2012/wordml" xmlns:wpg="http://schemas.microsoft.com/office/word/2010/wordprocessingGroup" xmlns:wpi="http://schemas.microsoft.com/office/word/2010/wordprocessingInk" xmlns:wne="http://schemas.microsoft.com/office/word/2006/wordml" xmlns:wps="http://schemas.microsoft.com/office/word/2010/wordprocessingShape" mc:Ignorable="w14 w15 wp14">
   <w:p>
     <w:pPr>
       <w:pStyle w:val="Footer"/>
@@ -2602,7 +2588,7 @@
       <w:rPr>
         <w:noProof/>
       </w:rPr>
-      <w:t>14</w:t>
+      <w:t>13</w:t>
     </w:r>
     <w:r>
       <w:fldChar w:fldCharType="end"/>
@@ -2612,7 +2598,7 @@
 </file>
 
 <file path=word/footnotes.xml><?xml version="1.0" encoding="utf-8"?>
-<w:footnotes xmlns:wpc="http://schemas.microsoft.com/office/word/2010/wordprocessingCanvas" xmlns:cx="http://schemas.microsoft.com/office/drawing/2014/chartex" xmlns:cx1="http://schemas.microsoft.com/office/drawing/2015/9/8/chartex" xmlns:cx2="http://schemas.microsoft.com/office/drawing/2015/10/21/chartex" xmlns:cx3="http://schemas.microsoft.com/office/drawing/2016/5/9/chartex" xmlns:cx4="http://schemas.microsoft.com/office/drawing/2016/5/10/chartex" xmlns:cx5="http://schemas.microsoft.com/office/drawing/2016/5/11/chartex" xmlns:cx6="http://schemas.microsoft.com/office/drawing/2016/5/12/chartex" xmlns:cx7="http://schemas.microsoft.com/office/drawing/2016/5/13/chartex" xmlns:cx8="http://schemas.microsoft.com/office/drawing/2016/5/14/chartex" xmlns:mc="http://schemas.openxmlformats.org/markup-compatibility/2006" xmlns:aink="http://schemas.microsoft.com/office/drawing/2016/ink" xmlns:am3d="http://schemas.microsoft.com/office/drawing/2017/model3d" xmlns:o="urn:schemas-microsoft-com:office:office" xmlns:oel="http://schemas.microsoft.com/office/2019/extlst" xmlns:r="http://schemas.openxmlformats.org/officeDocument/2006/relationships" xmlns:m="http://schemas.openxmlformats.org/officeDocument/2006/math" xmlns:v="urn:schemas-microsoft-com:vml" xmlns:wp14="http://schemas.microsoft.com/office/word/2010/wordprocessingDrawing" xmlns:wp="http://schemas.openxmlformats.org/drawingml/2006/wordprocessingDrawing" xmlns:w10="urn:schemas-microsoft-com:office:word" xmlns:w="http://schemas.openxmlformats.org/wordprocessingml/2006/main" xmlns:w14="http://schemas.microsoft.com/office/word/2010/wordml" xmlns:w15="http://schemas.microsoft.com/office/word/2012/wordml" xmlns:w16cex="http://schemas.microsoft.com/office/word/2018/wordml/cex" xmlns:w16cid="http://schemas.microsoft.com/office/word/2016/wordml/cid" xmlns:w16="http://schemas.microsoft.com/office/word/2018/wordml" xmlns:w16sdtdh="http://schemas.microsoft.com/office/word/2020/wordml/sdtdatahash" xmlns:w16se="http://schemas.microsoft.com/office/word/2015/wordml/symex" xmlns:wpg="http://schemas.microsoft.com/office/word/2010/wordprocessingGroup" xmlns:wpi="http://schemas.microsoft.com/office/word/2010/wordprocessingInk" xmlns:wne="http://schemas.microsoft.com/office/word/2006/wordml" xmlns:wps="http://schemas.microsoft.com/office/word/2010/wordprocessingShape" mc:Ignorable="w14 w15 w16se w16cid w16 w16cex w16sdtdh wp14">
+<w:footnotes xmlns:wpc="http://schemas.microsoft.com/office/word/2010/wordprocessingCanvas" xmlns:mc="http://schemas.openxmlformats.org/markup-compatibility/2006" xmlns:o="urn:schemas-microsoft-com:office:office" xmlns:r="http://schemas.openxmlformats.org/officeDocument/2006/relationships" xmlns:m="http://schemas.openxmlformats.org/officeDocument/2006/math" xmlns:v="urn:schemas-microsoft-com:vml" xmlns:wp14="http://schemas.microsoft.com/office/word/2010/wordprocessingDrawing" xmlns:wp="http://schemas.openxmlformats.org/drawingml/2006/wordprocessingDrawing" xmlns:w10="urn:schemas-microsoft-com:office:word" xmlns:w="http://schemas.openxmlformats.org/wordprocessingml/2006/main" xmlns:w14="http://schemas.microsoft.com/office/word/2010/wordml" xmlns:w15="http://schemas.microsoft.com/office/word/2012/wordml" xmlns:wpg="http://schemas.microsoft.com/office/word/2010/wordprocessingGroup" xmlns:wpi="http://schemas.microsoft.com/office/word/2010/wordprocessingInk" xmlns:wne="http://schemas.microsoft.com/office/word/2006/wordml" xmlns:wps="http://schemas.microsoft.com/office/word/2010/wordprocessingShape" mc:Ignorable="w14 w15 wp14">
   <w:footnote w:type="separator" w:id="-1">
     <w:p>
       <w:pPr>
@@ -2637,8 +2623,8 @@
 </file>
 
 <file path=word/numbering.xml><?xml version="1.0" encoding="utf-8"?>
-<w:numbering xmlns:wpc="http://schemas.microsoft.com/office/word/2010/wordprocessingCanvas" xmlns:cx="http://schemas.microsoft.com/office/drawing/2014/chartex" xmlns:cx1="http://schemas.microsoft.com/office/drawing/2015/9/8/chartex" xmlns:cx2="http://schemas.microsoft.com/office/drawing/2015/10/21/chartex" xmlns:cx3="http://schemas.microsoft.com/office/drawing/2016/5/9/chartex" xmlns:cx4="http://schemas.microsoft.com/office/drawing/2016/5/10/chartex" xmlns:cx5="http://schemas.microsoft.com/office/drawing/2016/5/11/chartex" xmlns:cx6="http://schemas.microsoft.com/office/drawing/2016/5/12/chartex" xmlns:cx7="http://schemas.microsoft.com/office/drawing/2016/5/13/chartex" xmlns:cx8="http://schemas.microsoft.com/office/drawing/2016/5/14/chartex" xmlns:mc="http://schemas.openxmlformats.org/markup-compatibility/2006" xmlns:aink="http://schemas.microsoft.com/office/drawing/2016/ink" xmlns:am3d="http://schemas.microsoft.com/office/drawing/2017/model3d" xmlns:o="urn:schemas-microsoft-com:office:office" xmlns:oel="http://schemas.microsoft.com/office/2019/extlst" xmlns:r="http://schemas.openxmlformats.org/officeDocument/2006/relationships" xmlns:m="http://schemas.openxmlformats.org/officeDocument/2006/math" xmlns:v="urn:schemas-microsoft-com:vml" xmlns:wp14="http://schemas.microsoft.com/office/word/2010/wordprocessingDrawing" xmlns:wp="http://schemas.openxmlformats.org/drawingml/2006/wordprocessingDrawing" xmlns:w10="urn:schemas-microsoft-com:office:word" xmlns:w="http://schemas.openxmlformats.org/wordprocessingml/2006/main" xmlns:w14="http://schemas.microsoft.com/office/word/2010/wordml" xmlns:w15="http://schemas.microsoft.com/office/word/2012/wordml" xmlns:w16cex="http://schemas.microsoft.com/office/word/2018/wordml/cex" xmlns:w16cid="http://schemas.microsoft.com/office/word/2016/wordml/cid" xmlns:w16="http://schemas.microsoft.com/office/word/2018/wordml" xmlns:w16sdtdh="http://schemas.microsoft.com/office/word/2020/wordml/sdtdatahash" xmlns:w16se="http://schemas.microsoft.com/office/word/2015/wordml/symex" xmlns:wpg="http://schemas.microsoft.com/office/word/2010/wordprocessingGroup" xmlns:wpi="http://schemas.microsoft.com/office/word/2010/wordprocessingInk" xmlns:wne="http://schemas.microsoft.com/office/word/2006/wordml" xmlns:wps="http://schemas.microsoft.com/office/word/2010/wordprocessingShape" mc:Ignorable="w14 w15 w16se w16cid w16 w16cex w16sdtdh wp14">
-  <w:abstractNum w:abstractNumId="0" w15:restartNumberingAfterBreak="0">
+<w:numbering xmlns:wpc="http://schemas.microsoft.com/office/word/2010/wordprocessingCanvas" xmlns:mc="http://schemas.openxmlformats.org/markup-compatibility/2006" xmlns:o="urn:schemas-microsoft-com:office:office" xmlns:r="http://schemas.openxmlformats.org/officeDocument/2006/relationships" xmlns:m="http://schemas.openxmlformats.org/officeDocument/2006/math" xmlns:v="urn:schemas-microsoft-com:vml" xmlns:wp14="http://schemas.microsoft.com/office/word/2010/wordprocessingDrawing" xmlns:wp="http://schemas.openxmlformats.org/drawingml/2006/wordprocessingDrawing" xmlns:w10="urn:schemas-microsoft-com:office:word" xmlns:w="http://schemas.openxmlformats.org/wordprocessingml/2006/main" xmlns:w14="http://schemas.microsoft.com/office/word/2010/wordml" xmlns:w15="http://schemas.microsoft.com/office/word/2012/wordml" xmlns:wpg="http://schemas.microsoft.com/office/word/2010/wordprocessingGroup" xmlns:wpi="http://schemas.microsoft.com/office/word/2010/wordprocessingInk" xmlns:wne="http://schemas.microsoft.com/office/word/2006/wordml" xmlns:wps="http://schemas.microsoft.com/office/word/2010/wordprocessingShape" mc:Ignorable="w14 w15 wp14">
+  <w:abstractNum w:abstractNumId="0">
     <w:nsid w:val="FFFFFF7C"/>
     <w:multiLevelType w:val="singleLevel"/>
     <w:tmpl w:val="61E62248"/>
@@ -2655,7 +2641,7 @@
       </w:pPr>
     </w:lvl>
   </w:abstractNum>
-  <w:abstractNum w:abstractNumId="1" w15:restartNumberingAfterBreak="0">
+  <w:abstractNum w:abstractNumId="1">
     <w:nsid w:val="FFFFFF7D"/>
     <w:multiLevelType w:val="singleLevel"/>
     <w:tmpl w:val="DADA94F2"/>
@@ -2672,7 +2658,7 @@
       </w:pPr>
     </w:lvl>
   </w:abstractNum>
-  <w:abstractNum w:abstractNumId="2" w15:restartNumberingAfterBreak="0">
+  <w:abstractNum w:abstractNumId="2">
     <w:nsid w:val="FFFFFF7E"/>
     <w:multiLevelType w:val="singleLevel"/>
     <w:tmpl w:val="A0E4E5B2"/>
@@ -2689,7 +2675,7 @@
       </w:pPr>
     </w:lvl>
   </w:abstractNum>
-  <w:abstractNum w:abstractNumId="3" w15:restartNumberingAfterBreak="0">
+  <w:abstractNum w:abstractNumId="3">
     <w:nsid w:val="FFFFFF7F"/>
     <w:multiLevelType w:val="singleLevel"/>
     <w:tmpl w:val="B4188A06"/>
@@ -2706,7 +2692,7 @@
       </w:pPr>
     </w:lvl>
   </w:abstractNum>
-  <w:abstractNum w:abstractNumId="4" w15:restartNumberingAfterBreak="0">
+  <w:abstractNum w:abstractNumId="4">
     <w:nsid w:val="FFFFFF80"/>
     <w:multiLevelType w:val="singleLevel"/>
     <w:tmpl w:val="1E0C080A"/>
@@ -2726,7 +2712,7 @@
       </w:rPr>
     </w:lvl>
   </w:abstractNum>
-  <w:abstractNum w:abstractNumId="5" w15:restartNumberingAfterBreak="0">
+  <w:abstractNum w:abstractNumId="5">
     <w:nsid w:val="FFFFFF81"/>
     <w:multiLevelType w:val="singleLevel"/>
     <w:tmpl w:val="CB9E1936"/>
@@ -2746,7 +2732,7 @@
       </w:rPr>
     </w:lvl>
   </w:abstractNum>
-  <w:abstractNum w:abstractNumId="6" w15:restartNumberingAfterBreak="0">
+  <w:abstractNum w:abstractNumId="6">
     <w:nsid w:val="FFFFFF82"/>
     <w:multiLevelType w:val="singleLevel"/>
     <w:tmpl w:val="13A06938"/>
@@ -2766,7 +2752,7 @@
       </w:rPr>
     </w:lvl>
   </w:abstractNum>
-  <w:abstractNum w:abstractNumId="7" w15:restartNumberingAfterBreak="0">
+  <w:abstractNum w:abstractNumId="7">
     <w:nsid w:val="FFFFFF83"/>
     <w:multiLevelType w:val="singleLevel"/>
     <w:tmpl w:val="93C8D00C"/>
@@ -2786,7 +2772,7 @@
       </w:rPr>
     </w:lvl>
   </w:abstractNum>
-  <w:abstractNum w:abstractNumId="8" w15:restartNumberingAfterBreak="0">
+  <w:abstractNum w:abstractNumId="8">
     <w:nsid w:val="FFFFFF88"/>
     <w:multiLevelType w:val="singleLevel"/>
     <w:tmpl w:val="B87E3E76"/>
@@ -2804,7 +2790,7 @@
       </w:pPr>
     </w:lvl>
   </w:abstractNum>
-  <w:abstractNum w:abstractNumId="9" w15:restartNumberingAfterBreak="0">
+  <w:abstractNum w:abstractNumId="9">
     <w:nsid w:val="FFFFFF89"/>
     <w:multiLevelType w:val="singleLevel"/>
     <w:tmpl w:val="BAA6FCB4"/>
@@ -2823,7 +2809,7 @@
       </w:rPr>
     </w:lvl>
   </w:abstractNum>
-  <w:abstractNum w:abstractNumId="10" w15:restartNumberingAfterBreak="0">
+  <w:abstractNum w:abstractNumId="10">
     <w:nsid w:val="01122BF4"/>
     <w:multiLevelType w:val="multilevel"/>
     <w:tmpl w:val="0409001D"/>
@@ -2909,7 +2895,7 @@
       </w:pPr>
     </w:lvl>
   </w:abstractNum>
-  <w:abstractNum w:abstractNumId="11" w15:restartNumberingAfterBreak="0">
+  <w:abstractNum w:abstractNumId="11">
     <w:nsid w:val="0D483622"/>
     <w:multiLevelType w:val="multilevel"/>
     <w:tmpl w:val="04090023"/>
@@ -2996,7 +2982,7 @@
       </w:pPr>
     </w:lvl>
   </w:abstractNum>
-  <w:abstractNum w:abstractNumId="12" w15:restartNumberingAfterBreak="0">
+  <w:abstractNum w:abstractNumId="12">
     <w:nsid w:val="129E7018"/>
     <w:multiLevelType w:val="hybridMultilevel"/>
     <w:tmpl w:val="457C020C"/>
@@ -3108,7 +3094,7 @@
       </w:rPr>
     </w:lvl>
   </w:abstractNum>
-  <w:abstractNum w:abstractNumId="13" w15:restartNumberingAfterBreak="0">
+  <w:abstractNum w:abstractNumId="13">
     <w:nsid w:val="398D09B4"/>
     <w:multiLevelType w:val="hybridMultilevel"/>
     <w:tmpl w:val="99AABE72"/>
@@ -3197,7 +3183,7 @@
       </w:pPr>
     </w:lvl>
   </w:abstractNum>
-  <w:abstractNum w:abstractNumId="14" w15:restartNumberingAfterBreak="0">
+  <w:abstractNum w:abstractNumId="14">
     <w:nsid w:val="47164D09"/>
     <w:multiLevelType w:val="multilevel"/>
     <w:tmpl w:val="0409001F"/>
@@ -3283,7 +3269,7 @@
       </w:pPr>
     </w:lvl>
   </w:abstractNum>
-  <w:abstractNum w:abstractNumId="15" w15:restartNumberingAfterBreak="0">
+  <w:abstractNum w:abstractNumId="15">
     <w:nsid w:val="57150680"/>
     <w:multiLevelType w:val="hybridMultilevel"/>
     <w:tmpl w:val="33D4C1E0"/>
@@ -3396,7 +3382,7 @@
       </w:rPr>
     </w:lvl>
   </w:abstractNum>
-  <w:abstractNum w:abstractNumId="16" w15:restartNumberingAfterBreak="0">
+  <w:abstractNum w:abstractNumId="16">
     <w:nsid w:val="57BD260E"/>
     <w:multiLevelType w:val="hybridMultilevel"/>
     <w:tmpl w:val="D4CAF8B0"/>
@@ -3485,68 +3471,68 @@
       </w:pPr>
     </w:lvl>
   </w:abstractNum>
-  <w:num w:numId="1" w16cid:durableId="819419945">
+  <w:num w:numId="1">
     <w:abstractNumId w:val="9"/>
   </w:num>
-  <w:num w:numId="2" w16cid:durableId="1855026511">
+  <w:num w:numId="2">
     <w:abstractNumId w:val="8"/>
   </w:num>
-  <w:num w:numId="3" w16cid:durableId="1209296468">
+  <w:num w:numId="3">
     <w:abstractNumId w:val="8"/>
   </w:num>
-  <w:num w:numId="4" w16cid:durableId="1111977891">
+  <w:num w:numId="4">
     <w:abstractNumId w:val="9"/>
   </w:num>
-  <w:num w:numId="5" w16cid:durableId="961114153">
+  <w:num w:numId="5">
     <w:abstractNumId w:val="14"/>
   </w:num>
-  <w:num w:numId="6" w16cid:durableId="1623346162">
+  <w:num w:numId="6">
     <w:abstractNumId w:val="10"/>
   </w:num>
-  <w:num w:numId="7" w16cid:durableId="479425760">
+  <w:num w:numId="7">
     <w:abstractNumId w:val="11"/>
   </w:num>
-  <w:num w:numId="8" w16cid:durableId="1506900898">
+  <w:num w:numId="8">
     <w:abstractNumId w:val="7"/>
   </w:num>
-  <w:num w:numId="9" w16cid:durableId="1491796243">
+  <w:num w:numId="9">
     <w:abstractNumId w:val="6"/>
   </w:num>
-  <w:num w:numId="10" w16cid:durableId="1368793703">
+  <w:num w:numId="10">
     <w:abstractNumId w:val="5"/>
   </w:num>
-  <w:num w:numId="11" w16cid:durableId="1076244544">
+  <w:num w:numId="11">
     <w:abstractNumId w:val="4"/>
   </w:num>
-  <w:num w:numId="12" w16cid:durableId="1157696057">
+  <w:num w:numId="12">
     <w:abstractNumId w:val="3"/>
   </w:num>
-  <w:num w:numId="13" w16cid:durableId="249119668">
+  <w:num w:numId="13">
     <w:abstractNumId w:val="2"/>
   </w:num>
-  <w:num w:numId="14" w16cid:durableId="1353920766">
+  <w:num w:numId="14">
     <w:abstractNumId w:val="1"/>
   </w:num>
-  <w:num w:numId="15" w16cid:durableId="868564512">
+  <w:num w:numId="15">
     <w:abstractNumId w:val="0"/>
   </w:num>
-  <w:num w:numId="16" w16cid:durableId="69430662">
+  <w:num w:numId="16">
     <w:abstractNumId w:val="12"/>
   </w:num>
-  <w:num w:numId="17" w16cid:durableId="380906864">
+  <w:num w:numId="17">
     <w:abstractNumId w:val="16"/>
   </w:num>
-  <w:num w:numId="18" w16cid:durableId="1737314125">
+  <w:num w:numId="18">
     <w:abstractNumId w:val="13"/>
   </w:num>
-  <w:num w:numId="19" w16cid:durableId="2096900564">
+  <w:num w:numId="19">
     <w:abstractNumId w:val="15"/>
   </w:num>
 </w:numbering>
 </file>
 
 <file path=word/styles.xml><?xml version="1.0" encoding="utf-8"?>
-<w:styles xmlns:mc="http://schemas.openxmlformats.org/markup-compatibility/2006" xmlns:r="http://schemas.openxmlformats.org/officeDocument/2006/relationships" xmlns:w="http://schemas.openxmlformats.org/wordprocessingml/2006/main" xmlns:w14="http://schemas.microsoft.com/office/word/2010/wordml" xmlns:w15="http://schemas.microsoft.com/office/word/2012/wordml" xmlns:w16cex="http://schemas.microsoft.com/office/word/2018/wordml/cex" xmlns:w16cid="http://schemas.microsoft.com/office/word/2016/wordml/cid" xmlns:w16="http://schemas.microsoft.com/office/word/2018/wordml" xmlns:w16sdtdh="http://schemas.microsoft.com/office/word/2020/wordml/sdtdatahash" xmlns:w16se="http://schemas.microsoft.com/office/word/2015/wordml/symex" mc:Ignorable="w14 w15 w16se w16cid w16 w16cex w16sdtdh">
+<w:styles xmlns:mc="http://schemas.openxmlformats.org/markup-compatibility/2006" xmlns:r="http://schemas.openxmlformats.org/officeDocument/2006/relationships" xmlns:w="http://schemas.openxmlformats.org/wordprocessingml/2006/main" xmlns:w14="http://schemas.microsoft.com/office/word/2010/wordml" xmlns:w15="http://schemas.microsoft.com/office/word/2012/wordml" mc:Ignorable="w14 w15">
   <w:docDefaults>
     <w:rPrDefault>
       <w:rPr>
@@ -3563,7 +3549,7 @@
       </w:pPr>
     </w:pPrDefault>
   </w:docDefaults>
-  <w:latentStyles w:defLockedState="0" w:defUIPriority="99" w:defSemiHidden="0" w:defUnhideWhenUsed="0" w:defQFormat="0" w:count="376">
+  <w:latentStyles w:defLockedState="0" w:defUIPriority="99" w:defSemiHidden="0" w:defUnhideWhenUsed="0" w:defQFormat="0" w:count="371">
     <w:lsdException w:name="Normal" w:uiPriority="0" w:qFormat="1"/>
     <w:lsdException w:name="heading 1" w:uiPriority="9" w:qFormat="1"/>
     <w:lsdException w:name="heading 2" w:semiHidden="1" w:uiPriority="9" w:unhideWhenUsed="1" w:qFormat="1"/>
@@ -3935,11 +3921,6 @@
     <w:lsdException w:name="List Table 5 Dark Accent 6" w:uiPriority="50"/>
     <w:lsdException w:name="List Table 6 Colorful Accent 6" w:uiPriority="51"/>
     <w:lsdException w:name="List Table 7 Colorful Accent 6" w:uiPriority="52"/>
-    <w:lsdException w:name="Mention" w:semiHidden="1" w:unhideWhenUsed="1"/>
-    <w:lsdException w:name="Smart Hyperlink" w:semiHidden="1" w:unhideWhenUsed="1"/>
-    <w:lsdException w:name="Hashtag" w:semiHidden="1" w:unhideWhenUsed="1"/>
-    <w:lsdException w:name="Unresolved Mention" w:semiHidden="1" w:unhideWhenUsed="1"/>
-    <w:lsdException w:name="Smart Link" w:semiHidden="1" w:unhideWhenUsed="1"/>
   </w:latentStyles>
   <w:style w:type="paragraph" w:default="1" w:styleId="Normal">
     <w:name w:val="Normal"/>
@@ -5241,7 +5222,7 @@
 </file>
 
 <file path=customXml/itemProps1.xml><?xml version="1.0" encoding="utf-8"?>
-<ds:datastoreItem xmlns:ds="http://schemas.openxmlformats.org/officeDocument/2006/customXml" ds:itemID="{3DE3ABE9-4E0E-4E5C-95B1-EBD150263490}">
+<ds:datastoreItem xmlns:ds="http://schemas.openxmlformats.org/officeDocument/2006/customXml" ds:itemID="{AE443FBA-2720-4645-A3C5-91EECE55798A}">
   <ds:schemaRefs>
     <ds:schemaRef ds:uri="http://schemas.openxmlformats.org/officeDocument/2006/bibliography"/>
   </ds:schemaRefs>

</xml_diff>

<commit_message>
Upload MCU Clocks Labs
</commit_message>
<xml_diff>
--- a/Unit_5_First_Term_Projects/Project1_Pressure_Detection/Sys_ARCH_Model/Project_1_Report.docx
+++ b/Unit_5_First_Term_Projects/Project1_Pressure_Detection/Sys_ARCH_Model/Project_1_Report.docx
@@ -227,9 +227,7 @@
               <w:rFonts w:eastAsiaTheme="minorEastAsia"/>
               <w:noProof/>
               <w:color w:val="auto"/>
-              <w:kern w:val="2"/>
               <w:lang w:val="de-AT" w:eastAsia="de-AT"/>
-              <w14:ligatures w14:val="standardContextual"/>
             </w:rPr>
           </w:pPr>
           <w:r>
@@ -241,13 +239,131 @@
           <w:r>
             <w:fldChar w:fldCharType="separate"/>
           </w:r>
-          <w:hyperlink w:anchor="_Toc173861339" w:history="1">
+          <w:bookmarkStart w:id="5" w:name="_GoBack"/>
+          <w:bookmarkEnd w:id="5"/>
+          <w:r>
+            <w:rPr>
+              <w:rStyle w:val="Hyperlink"/>
+              <w:noProof/>
+            </w:rPr>
+            <w:fldChar w:fldCharType="begin"/>
+          </w:r>
+          <w:r>
+            <w:rPr>
+              <w:rStyle w:val="Hyperlink"/>
+              <w:noProof/>
+            </w:rPr>
+            <w:instrText xml:space="preserve"> </w:instrText>
+          </w:r>
+          <w:r>
+            <w:rPr>
+              <w:noProof/>
+            </w:rPr>
+            <w:instrText>HYPERLINK \l "_Toc174702232"</w:instrText>
+          </w:r>
+          <w:r>
+            <w:rPr>
+              <w:rStyle w:val="Hyperlink"/>
+              <w:noProof/>
+            </w:rPr>
+            <w:instrText xml:space="preserve"> </w:instrText>
+          </w:r>
+          <w:r>
+            <w:rPr>
+              <w:rStyle w:val="Hyperlink"/>
+              <w:noProof/>
+            </w:rPr>
+          </w:r>
+          <w:r>
+            <w:rPr>
+              <w:rStyle w:val="Hyperlink"/>
+              <w:noProof/>
+            </w:rPr>
+            <w:fldChar w:fldCharType="separate"/>
+          </w:r>
+          <w:r>
+            <w:rPr>
+              <w:rStyle w:val="Hyperlink"/>
+              <w:noProof/>
+            </w:rPr>
+            <w:t>Case Study</w:t>
+          </w:r>
+          <w:r>
+            <w:rPr>
+              <w:noProof/>
+              <w:webHidden/>
+            </w:rPr>
+            <w:tab/>
+          </w:r>
+          <w:r>
+            <w:rPr>
+              <w:noProof/>
+              <w:webHidden/>
+            </w:rPr>
+            <w:fldChar w:fldCharType="begin"/>
+          </w:r>
+          <w:r>
+            <w:rPr>
+              <w:noProof/>
+              <w:webHidden/>
+            </w:rPr>
+            <w:instrText xml:space="preserve"> PAGEREF _Toc174702232 \h </w:instrText>
+          </w:r>
+          <w:r>
+            <w:rPr>
+              <w:noProof/>
+              <w:webHidden/>
+            </w:rPr>
+          </w:r>
+          <w:r>
+            <w:rPr>
+              <w:noProof/>
+              <w:webHidden/>
+            </w:rPr>
+            <w:fldChar w:fldCharType="separate"/>
+          </w:r>
+          <w:r>
+            <w:rPr>
+              <w:noProof/>
+              <w:webHidden/>
+            </w:rPr>
+            <w:t>2</w:t>
+          </w:r>
+          <w:r>
+            <w:rPr>
+              <w:noProof/>
+              <w:webHidden/>
+            </w:rPr>
+            <w:fldChar w:fldCharType="end"/>
+          </w:r>
+          <w:r>
+            <w:rPr>
+              <w:rStyle w:val="Hyperlink"/>
+              <w:noProof/>
+            </w:rPr>
+            <w:fldChar w:fldCharType="end"/>
+          </w:r>
+        </w:p>
+        <w:p>
+          <w:pPr>
+            <w:pStyle w:val="TOC1"/>
+            <w:tabs>
+              <w:tab w:val="right" w:leader="dot" w:pos="8630"/>
+            </w:tabs>
+            <w:rPr>
+              <w:rFonts w:eastAsiaTheme="minorEastAsia"/>
+              <w:noProof/>
+              <w:color w:val="auto"/>
+              <w:lang w:val="de-AT" w:eastAsia="de-AT"/>
+            </w:rPr>
+          </w:pPr>
+          <w:hyperlink w:anchor="_Toc174702233" w:history="1">
             <w:r>
               <w:rPr>
                 <w:rStyle w:val="Hyperlink"/>
                 <w:noProof/>
               </w:rPr>
-              <w:t>Case Study</w:t>
+              <w:t>Methodology</w:t>
             </w:r>
             <w:r>
               <w:rPr>
@@ -268,7 +384,7 @@
                 <w:noProof/>
                 <w:webHidden/>
               </w:rPr>
-              <w:instrText xml:space="preserve"> PAGEREF _Toc173861339 \h </w:instrText>
+              <w:instrText xml:space="preserve"> PAGEREF _Toc174702233 \h </w:instrText>
             </w:r>
             <w:r>
               <w:rPr>
@@ -309,18 +425,16 @@
               <w:rFonts w:eastAsiaTheme="minorEastAsia"/>
               <w:noProof/>
               <w:color w:val="auto"/>
-              <w:kern w:val="2"/>
               <w:lang w:val="de-AT" w:eastAsia="de-AT"/>
-              <w14:ligatures w14:val="standardContextual"/>
             </w:rPr>
           </w:pPr>
-          <w:hyperlink w:anchor="_Toc173861340" w:history="1">
+          <w:hyperlink w:anchor="_Toc174702234" w:history="1">
             <w:r>
               <w:rPr>
                 <w:rStyle w:val="Hyperlink"/>
                 <w:noProof/>
               </w:rPr>
-              <w:t>Methodology</w:t>
+              <w:t>Requirement Diagram</w:t>
             </w:r>
             <w:r>
               <w:rPr>
@@ -341,7 +455,7 @@
                 <w:noProof/>
                 <w:webHidden/>
               </w:rPr>
-              <w:instrText xml:space="preserve"> PAGEREF _Toc173861340 \h </w:instrText>
+              <w:instrText xml:space="preserve"> PAGEREF _Toc174702234 \h </w:instrText>
             </w:r>
             <w:r>
               <w:rPr>
@@ -361,7 +475,7 @@
                 <w:noProof/>
                 <w:webHidden/>
               </w:rPr>
-              <w:t>2</w:t>
+              <w:t>3</w:t>
             </w:r>
             <w:r>
               <w:rPr>
@@ -382,18 +496,16 @@
               <w:rFonts w:eastAsiaTheme="minorEastAsia"/>
               <w:noProof/>
               <w:color w:val="auto"/>
-              <w:kern w:val="2"/>
               <w:lang w:val="de-AT" w:eastAsia="de-AT"/>
-              <w14:ligatures w14:val="standardContextual"/>
             </w:rPr>
           </w:pPr>
-          <w:hyperlink w:anchor="_Toc173861341" w:history="1">
+          <w:hyperlink w:anchor="_Toc174702235" w:history="1">
             <w:r>
               <w:rPr>
                 <w:rStyle w:val="Hyperlink"/>
                 <w:noProof/>
               </w:rPr>
-              <w:t>Requirement Diagram</w:t>
+              <w:t>System Analysis / Use Case Diagram</w:t>
             </w:r>
             <w:r>
               <w:rPr>
@@ -414,7 +526,7 @@
                 <w:noProof/>
                 <w:webHidden/>
               </w:rPr>
-              <w:instrText xml:space="preserve"> PAGEREF _Toc173861341 \h </w:instrText>
+              <w:instrText xml:space="preserve"> PAGEREF _Toc174702235 \h </w:instrText>
             </w:r>
             <w:r>
               <w:rPr>
@@ -455,18 +567,16 @@
               <w:rFonts w:eastAsiaTheme="minorEastAsia"/>
               <w:noProof/>
               <w:color w:val="auto"/>
-              <w:kern w:val="2"/>
               <w:lang w:val="de-AT" w:eastAsia="de-AT"/>
-              <w14:ligatures w14:val="standardContextual"/>
             </w:rPr>
           </w:pPr>
-          <w:hyperlink w:anchor="_Toc173861342" w:history="1">
+          <w:hyperlink w:anchor="_Toc174702236" w:history="1">
             <w:r>
               <w:rPr>
                 <w:rStyle w:val="Hyperlink"/>
                 <w:noProof/>
               </w:rPr>
-              <w:t>System Analysis / Use Case Diagram</w:t>
+              <w:t>Activity Diagram</w:t>
             </w:r>
             <w:r>
               <w:rPr>
@@ -487,7 +597,7 @@
                 <w:noProof/>
                 <w:webHidden/>
               </w:rPr>
-              <w:instrText xml:space="preserve"> PAGEREF _Toc173861342 \h </w:instrText>
+              <w:instrText xml:space="preserve"> PAGEREF _Toc174702236 \h </w:instrText>
             </w:r>
             <w:r>
               <w:rPr>
@@ -507,7 +617,7 @@
                 <w:noProof/>
                 <w:webHidden/>
               </w:rPr>
-              <w:t>3</w:t>
+              <w:t>4</w:t>
             </w:r>
             <w:r>
               <w:rPr>
@@ -528,18 +638,16 @@
               <w:rFonts w:eastAsiaTheme="minorEastAsia"/>
               <w:noProof/>
               <w:color w:val="auto"/>
-              <w:kern w:val="2"/>
               <w:lang w:val="de-AT" w:eastAsia="de-AT"/>
-              <w14:ligatures w14:val="standardContextual"/>
             </w:rPr>
           </w:pPr>
-          <w:hyperlink w:anchor="_Toc173861343" w:history="1">
+          <w:hyperlink w:anchor="_Toc174702237" w:history="1">
             <w:r>
               <w:rPr>
                 <w:rStyle w:val="Hyperlink"/>
                 <w:noProof/>
               </w:rPr>
-              <w:t>Activity Diagram</w:t>
+              <w:t>Sequence Diagram</w:t>
             </w:r>
             <w:r>
               <w:rPr>
@@ -560,7 +668,7 @@
                 <w:noProof/>
                 <w:webHidden/>
               </w:rPr>
-              <w:instrText xml:space="preserve"> PAGEREF _Toc173861343 \h </w:instrText>
+              <w:instrText xml:space="preserve"> PAGEREF _Toc174702237 \h </w:instrText>
             </w:r>
             <w:r>
               <w:rPr>
@@ -580,7 +688,7 @@
                 <w:noProof/>
                 <w:webHidden/>
               </w:rPr>
-              <w:t>4</w:t>
+              <w:t>5</w:t>
             </w:r>
             <w:r>
               <w:rPr>
@@ -601,18 +709,16 @@
               <w:rFonts w:eastAsiaTheme="minorEastAsia"/>
               <w:noProof/>
               <w:color w:val="auto"/>
-              <w:kern w:val="2"/>
               <w:lang w:val="de-AT" w:eastAsia="de-AT"/>
-              <w14:ligatures w14:val="standardContextual"/>
             </w:rPr>
           </w:pPr>
-          <w:hyperlink w:anchor="_Toc173861344" w:history="1">
+          <w:hyperlink w:anchor="_Toc174702238" w:history="1">
             <w:r>
               <w:rPr>
                 <w:rStyle w:val="Hyperlink"/>
                 <w:noProof/>
               </w:rPr>
-              <w:t>Sequence Diagram</w:t>
+              <w:t>System / Software Design</w:t>
             </w:r>
             <w:r>
               <w:rPr>
@@ -633,7 +739,7 @@
                 <w:noProof/>
                 <w:webHidden/>
               </w:rPr>
-              <w:instrText xml:space="preserve"> PAGEREF _Toc173861344 \h </w:instrText>
+              <w:instrText xml:space="preserve"> PAGEREF _Toc174702238 \h </w:instrText>
             </w:r>
             <w:r>
               <w:rPr>
@@ -653,7 +759,7 @@
                 <w:noProof/>
                 <w:webHidden/>
               </w:rPr>
-              <w:t>5</w:t>
+              <w:t>6</w:t>
             </w:r>
             <w:r>
               <w:rPr>
@@ -674,18 +780,16 @@
               <w:rFonts w:eastAsiaTheme="minorEastAsia"/>
               <w:noProof/>
               <w:color w:val="auto"/>
-              <w:kern w:val="2"/>
               <w:lang w:val="de-AT" w:eastAsia="de-AT"/>
-              <w14:ligatures w14:val="standardContextual"/>
             </w:rPr>
           </w:pPr>
-          <w:hyperlink w:anchor="_Toc173861345" w:history="1">
+          <w:hyperlink w:anchor="_Toc174702239" w:history="1">
             <w:r>
               <w:rPr>
                 <w:rStyle w:val="Hyperlink"/>
                 <w:noProof/>
               </w:rPr>
-              <w:t>System / Software Design</w:t>
+              <w:t>State Diagrams:</w:t>
             </w:r>
             <w:r>
               <w:rPr>
@@ -706,80 +810,7 @@
                 <w:noProof/>
                 <w:webHidden/>
               </w:rPr>
-              <w:instrText xml:space="preserve"> PAGEREF _Toc173861345 \h </w:instrText>
-            </w:r>
-            <w:r>
-              <w:rPr>
-                <w:noProof/>
-                <w:webHidden/>
-              </w:rPr>
-            </w:r>
-            <w:r>
-              <w:rPr>
-                <w:noProof/>
-                <w:webHidden/>
-              </w:rPr>
-              <w:fldChar w:fldCharType="separate"/>
-            </w:r>
-            <w:r>
-              <w:rPr>
-                <w:noProof/>
-                <w:webHidden/>
-              </w:rPr>
-              <w:t>6</w:t>
-            </w:r>
-            <w:r>
-              <w:rPr>
-                <w:noProof/>
-                <w:webHidden/>
-              </w:rPr>
-              <w:fldChar w:fldCharType="end"/>
-            </w:r>
-          </w:hyperlink>
-        </w:p>
-        <w:p>
-          <w:pPr>
-            <w:pStyle w:val="TOC1"/>
-            <w:tabs>
-              <w:tab w:val="right" w:leader="dot" w:pos="8630"/>
-            </w:tabs>
-            <w:rPr>
-              <w:rFonts w:eastAsiaTheme="minorEastAsia"/>
-              <w:noProof/>
-              <w:color w:val="auto"/>
-              <w:kern w:val="2"/>
-              <w:lang w:val="de-AT" w:eastAsia="de-AT"/>
-              <w14:ligatures w14:val="standardContextual"/>
-            </w:rPr>
-          </w:pPr>
-          <w:hyperlink w:anchor="_Toc173861346" w:history="1">
-            <w:r>
-              <w:rPr>
-                <w:rStyle w:val="Hyperlink"/>
-                <w:noProof/>
-              </w:rPr>
-              <w:t>State Diagrams:</w:t>
-            </w:r>
-            <w:r>
-              <w:rPr>
-                <w:noProof/>
-                <w:webHidden/>
-              </w:rPr>
-              <w:tab/>
-            </w:r>
-            <w:r>
-              <w:rPr>
-                <w:noProof/>
-                <w:webHidden/>
-              </w:rPr>
-              <w:fldChar w:fldCharType="begin"/>
-            </w:r>
-            <w:r>
-              <w:rPr>
-                <w:noProof/>
-                <w:webHidden/>
-              </w:rPr>
-              <w:instrText xml:space="preserve"> PAGEREF _Toc173861346 \h </w:instrText>
+              <w:instrText xml:space="preserve"> PAGEREF _Toc174702239 \h </w:instrText>
             </w:r>
             <w:r>
               <w:rPr>
@@ -821,12 +852,10 @@
               <w:rFonts w:eastAsiaTheme="minorEastAsia"/>
               <w:noProof/>
               <w:color w:val="auto"/>
-              <w:kern w:val="2"/>
               <w:lang w:val="de-AT" w:eastAsia="de-AT"/>
-              <w14:ligatures w14:val="standardContextual"/>
             </w:rPr>
           </w:pPr>
-          <w:hyperlink w:anchor="_Toc173861347" w:history="1">
+          <w:hyperlink w:anchor="_Toc174702240" w:history="1">
             <w:r>
               <w:rPr>
                 <w:rStyle w:val="Hyperlink"/>
@@ -840,9 +869,7 @@
                 <w:rFonts w:eastAsiaTheme="minorEastAsia"/>
                 <w:noProof/>
                 <w:color w:val="auto"/>
-                <w:kern w:val="2"/>
                 <w:lang w:val="de-AT" w:eastAsia="de-AT"/>
-                <w14:ligatures w14:val="standardContextual"/>
               </w:rPr>
               <w:tab/>
             </w:r>
@@ -872,7 +899,7 @@
                 <w:noProof/>
                 <w:webHidden/>
               </w:rPr>
-              <w:instrText xml:space="preserve"> PAGEREF _Toc173861347 \h </w:instrText>
+              <w:instrText xml:space="preserve"> PAGEREF _Toc174702240 \h </w:instrText>
             </w:r>
             <w:r>
               <w:rPr>
@@ -914,12 +941,10 @@
               <w:rFonts w:eastAsiaTheme="minorEastAsia"/>
               <w:noProof/>
               <w:color w:val="auto"/>
-              <w:kern w:val="2"/>
               <w:lang w:val="de-AT" w:eastAsia="de-AT"/>
-              <w14:ligatures w14:val="standardContextual"/>
             </w:rPr>
           </w:pPr>
-          <w:hyperlink w:anchor="_Toc173861348" w:history="1">
+          <w:hyperlink w:anchor="_Toc174702241" w:history="1">
             <w:r>
               <w:rPr>
                 <w:rStyle w:val="Hyperlink"/>
@@ -933,9 +958,7 @@
                 <w:rFonts w:eastAsiaTheme="minorEastAsia"/>
                 <w:noProof/>
                 <w:color w:val="auto"/>
-                <w:kern w:val="2"/>
                 <w:lang w:val="de-AT" w:eastAsia="de-AT"/>
-                <w14:ligatures w14:val="standardContextual"/>
               </w:rPr>
               <w:tab/>
             </w:r>
@@ -965,7 +988,7 @@
                 <w:noProof/>
                 <w:webHidden/>
               </w:rPr>
-              <w:instrText xml:space="preserve"> PAGEREF _Toc173861348 \h </w:instrText>
+              <w:instrText xml:space="preserve"> PAGEREF _Toc174702241 \h </w:instrText>
             </w:r>
             <w:r>
               <w:rPr>
@@ -1007,12 +1030,10 @@
               <w:rFonts w:eastAsiaTheme="minorEastAsia"/>
               <w:noProof/>
               <w:color w:val="auto"/>
-              <w:kern w:val="2"/>
               <w:lang w:val="de-AT" w:eastAsia="de-AT"/>
-              <w14:ligatures w14:val="standardContextual"/>
             </w:rPr>
           </w:pPr>
-          <w:hyperlink w:anchor="_Toc173861349" w:history="1">
+          <w:hyperlink w:anchor="_Toc174702242" w:history="1">
             <w:r>
               <w:rPr>
                 <w:rStyle w:val="Hyperlink"/>
@@ -1026,9 +1047,7 @@
                 <w:rFonts w:eastAsiaTheme="minorEastAsia"/>
                 <w:noProof/>
                 <w:color w:val="auto"/>
-                <w:kern w:val="2"/>
                 <w:lang w:val="de-AT" w:eastAsia="de-AT"/>
-                <w14:ligatures w14:val="standardContextual"/>
               </w:rPr>
               <w:tab/>
             </w:r>
@@ -1058,7 +1077,7 @@
                 <w:noProof/>
                 <w:webHidden/>
               </w:rPr>
-              <w:instrText xml:space="preserve"> PAGEREF _Toc173861349 \h </w:instrText>
+              <w:instrText xml:space="preserve"> PAGEREF _Toc174702242 \h </w:instrText>
             </w:r>
             <w:r>
               <w:rPr>
@@ -1100,12 +1119,10 @@
               <w:rFonts w:eastAsiaTheme="minorEastAsia"/>
               <w:noProof/>
               <w:color w:val="auto"/>
-              <w:kern w:val="2"/>
               <w:lang w:val="de-AT" w:eastAsia="de-AT"/>
-              <w14:ligatures w14:val="standardContextual"/>
             </w:rPr>
           </w:pPr>
-          <w:hyperlink w:anchor="_Toc173861350" w:history="1">
+          <w:hyperlink w:anchor="_Toc174702243" w:history="1">
             <w:r>
               <w:rPr>
                 <w:rStyle w:val="Hyperlink"/>
@@ -1119,9 +1136,7 @@
                 <w:rFonts w:eastAsiaTheme="minorEastAsia"/>
                 <w:noProof/>
                 <w:color w:val="auto"/>
-                <w:kern w:val="2"/>
                 <w:lang w:val="de-AT" w:eastAsia="de-AT"/>
-                <w14:ligatures w14:val="standardContextual"/>
               </w:rPr>
               <w:tab/>
             </w:r>
@@ -1151,7 +1166,7 @@
                 <w:noProof/>
                 <w:webHidden/>
               </w:rPr>
-              <w:instrText xml:space="preserve"> PAGEREF _Toc173861350 \h </w:instrText>
+              <w:instrText xml:space="preserve"> PAGEREF _Toc174702243 \h </w:instrText>
             </w:r>
             <w:r>
               <w:rPr>
@@ -1192,12 +1207,10 @@
               <w:rFonts w:eastAsiaTheme="minorEastAsia"/>
               <w:noProof/>
               <w:color w:val="auto"/>
-              <w:kern w:val="2"/>
               <w:lang w:val="de-AT" w:eastAsia="de-AT"/>
-              <w14:ligatures w14:val="standardContextual"/>
             </w:rPr>
           </w:pPr>
-          <w:hyperlink w:anchor="_Toc173861351" w:history="1">
+          <w:hyperlink w:anchor="_Toc174702244" w:history="1">
             <w:r>
               <w:rPr>
                 <w:rStyle w:val="Hyperlink"/>
@@ -1224,7 +1237,7 @@
                 <w:noProof/>
                 <w:webHidden/>
               </w:rPr>
-              <w:instrText xml:space="preserve"> PAGEREF _Toc173861351 \h </w:instrText>
+              <w:instrText xml:space="preserve"> PAGEREF _Toc174702244 \h </w:instrText>
             </w:r>
             <w:r>
               <w:rPr>
@@ -1265,12 +1278,10 @@
               <w:rFonts w:eastAsiaTheme="minorEastAsia"/>
               <w:noProof/>
               <w:color w:val="auto"/>
-              <w:kern w:val="2"/>
               <w:lang w:val="de-AT" w:eastAsia="de-AT"/>
-              <w14:ligatures w14:val="standardContextual"/>
             </w:rPr>
           </w:pPr>
-          <w:hyperlink w:anchor="_Toc173861352" w:history="1">
+          <w:hyperlink w:anchor="_Toc174702245" w:history="1">
             <w:r>
               <w:rPr>
                 <w:rStyle w:val="Hyperlink"/>
@@ -1297,7 +1308,7 @@
                 <w:noProof/>
                 <w:webHidden/>
               </w:rPr>
-              <w:instrText xml:space="preserve"> PAGEREF _Toc173861352 \h </w:instrText>
+              <w:instrText xml:space="preserve"> PAGEREF _Toc174702245 \h </w:instrText>
             </w:r>
             <w:r>
               <w:rPr>
@@ -1356,12 +1367,12 @@
       <w:pPr>
         <w:pStyle w:val="Heading1"/>
       </w:pPr>
-      <w:bookmarkStart w:id="5" w:name="_Toc173861339"/>
+      <w:bookmarkStart w:id="6" w:name="_Toc174702232"/>
       <w:r>
         <w:lastRenderedPageBreak/>
         <w:t>Case Study</w:t>
       </w:r>
-      <w:bookmarkEnd w:id="5"/>
+      <w:bookmarkEnd w:id="6"/>
     </w:p>
     <w:p>
       <w:r>
@@ -1541,11 +1552,11 @@
       <w:pPr>
         <w:pStyle w:val="Heading1"/>
       </w:pPr>
-      <w:bookmarkStart w:id="6" w:name="_Toc173861340"/>
+      <w:bookmarkStart w:id="7" w:name="_Toc174702233"/>
       <w:r>
         <w:t>Methodology</w:t>
       </w:r>
-      <w:bookmarkEnd w:id="6"/>
+      <w:bookmarkEnd w:id="7"/>
     </w:p>
     <w:p>
       <w:r>
@@ -1575,12 +1586,12 @@
       <w:pPr>
         <w:pStyle w:val="Heading1"/>
       </w:pPr>
-      <w:bookmarkStart w:id="7" w:name="_Toc173861341"/>
+      <w:bookmarkStart w:id="8" w:name="_Toc174702234"/>
       <w:r>
         <w:lastRenderedPageBreak/>
         <w:t>Requirement Diagram</w:t>
       </w:r>
-      <w:bookmarkEnd w:id="7"/>
+      <w:bookmarkEnd w:id="8"/>
     </w:p>
     <w:p>
       <w:r>
@@ -1642,14 +1653,14 @@
       <w:pPr>
         <w:pStyle w:val="Heading1"/>
       </w:pPr>
-      <w:bookmarkStart w:id="8" w:name="_Toc173861342"/>
+      <w:bookmarkStart w:id="9" w:name="_Toc174702235"/>
       <w:r>
         <w:t>System Analysis</w:t>
       </w:r>
       <w:r>
         <w:t xml:space="preserve"> / Use Case Diagram</w:t>
       </w:r>
-      <w:bookmarkEnd w:id="8"/>
+      <w:bookmarkEnd w:id="9"/>
       <w:r>
         <w:t xml:space="preserve"> </w:t>
       </w:r>
@@ -1714,12 +1725,12 @@
       <w:pPr>
         <w:pStyle w:val="Heading1"/>
       </w:pPr>
-      <w:bookmarkStart w:id="9" w:name="_Toc173861343"/>
+      <w:bookmarkStart w:id="10" w:name="_Toc174702236"/>
       <w:r>
         <w:lastRenderedPageBreak/>
         <w:t>Activity Diagram</w:t>
       </w:r>
-      <w:bookmarkEnd w:id="9"/>
+      <w:bookmarkEnd w:id="10"/>
       <w:r>
         <w:t xml:space="preserve"> </w:t>
       </w:r>
@@ -1786,12 +1797,12 @@
       <w:pPr>
         <w:pStyle w:val="Heading1"/>
       </w:pPr>
-      <w:bookmarkStart w:id="10" w:name="_Toc173861344"/>
+      <w:bookmarkStart w:id="11" w:name="_Toc174702237"/>
       <w:r>
         <w:lastRenderedPageBreak/>
         <w:t>Sequence Diagram</w:t>
       </w:r>
-      <w:bookmarkEnd w:id="10"/>
+      <w:bookmarkEnd w:id="11"/>
       <w:r>
         <w:t xml:space="preserve"> </w:t>
       </w:r>
@@ -1858,12 +1869,12 @@
       <w:pPr>
         <w:pStyle w:val="Heading1"/>
       </w:pPr>
-      <w:bookmarkStart w:id="11" w:name="_Toc173861345"/>
+      <w:bookmarkStart w:id="12" w:name="_Toc174702238"/>
       <w:r>
         <w:lastRenderedPageBreak/>
         <w:t>System / Software Design</w:t>
       </w:r>
-      <w:bookmarkEnd w:id="11"/>
+      <w:bookmarkEnd w:id="12"/>
       <w:r>
         <w:t xml:space="preserve"> </w:t>
       </w:r>
@@ -1928,7 +1939,7 @@
       <w:pPr>
         <w:pStyle w:val="Heading1"/>
       </w:pPr>
-      <w:bookmarkStart w:id="12" w:name="_Toc173861346"/>
+      <w:bookmarkStart w:id="13" w:name="_Toc174702239"/>
       <w:r>
         <w:lastRenderedPageBreak/>
         <w:t>Sta</w:t>
@@ -1942,7 +1953,7 @@
       <w:r>
         <w:t>:</w:t>
       </w:r>
-      <w:bookmarkEnd w:id="12"/>
+      <w:bookmarkEnd w:id="13"/>
     </w:p>
     <w:p>
       <w:pPr>
@@ -1952,11 +1963,11 @@
           <w:numId w:val="19"/>
         </w:numPr>
       </w:pPr>
-      <w:bookmarkStart w:id="13" w:name="_Toc173861347"/>
+      <w:bookmarkStart w:id="14" w:name="_Toc174702240"/>
       <w:r>
         <w:t>Pressure Sensor Diver</w:t>
       </w:r>
-      <w:bookmarkEnd w:id="13"/>
+      <w:bookmarkEnd w:id="14"/>
       <w:r>
         <w:t xml:space="preserve"> </w:t>
       </w:r>
@@ -2026,7 +2037,7 @@
           <w:numId w:val="18"/>
         </w:numPr>
       </w:pPr>
-      <w:bookmarkStart w:id="14" w:name="_Toc173861348"/>
+      <w:bookmarkStart w:id="15" w:name="_Toc174702241"/>
       <w:r>
         <w:lastRenderedPageBreak/>
         <w:t>Pressure</w:t>
@@ -2040,7 +2051,7 @@
       <w:r>
         <w:t>Functionality</w:t>
       </w:r>
-      <w:bookmarkEnd w:id="14"/>
+      <w:bookmarkEnd w:id="15"/>
       <w:r>
         <w:t xml:space="preserve"> </w:t>
       </w:r>
@@ -2111,12 +2122,12 @@
           <w:numId w:val="18"/>
         </w:numPr>
       </w:pPr>
-      <w:bookmarkStart w:id="15" w:name="_Toc173861349"/>
+      <w:bookmarkStart w:id="16" w:name="_Toc174702242"/>
       <w:r>
         <w:lastRenderedPageBreak/>
         <w:t>Alarm handling</w:t>
       </w:r>
-      <w:bookmarkEnd w:id="15"/>
+      <w:bookmarkEnd w:id="16"/>
       <w:r>
         <w:t xml:space="preserve"> </w:t>
       </w:r>
@@ -2190,7 +2201,7 @@
           <w:numId w:val="18"/>
         </w:numPr>
       </w:pPr>
-      <w:bookmarkStart w:id="16" w:name="_Toc173861350"/>
+      <w:bookmarkStart w:id="17" w:name="_Toc174702243"/>
       <w:r>
         <w:lastRenderedPageBreak/>
         <w:t>Pressure</w:t>
@@ -2204,7 +2215,7 @@
       <w:r>
         <w:t xml:space="preserve"> Driver</w:t>
       </w:r>
-      <w:bookmarkEnd w:id="16"/>
+      <w:bookmarkEnd w:id="17"/>
       <w:r>
         <w:t xml:space="preserve"> </w:t>
       </w:r>
@@ -2278,12 +2289,12 @@
       <w:pPr>
         <w:pStyle w:val="Heading1"/>
       </w:pPr>
-      <w:bookmarkStart w:id="17" w:name="_Toc173861351"/>
+      <w:bookmarkStart w:id="18" w:name="_Toc174702244"/>
       <w:r>
         <w:lastRenderedPageBreak/>
         <w:t>Software Implementation</w:t>
       </w:r>
-      <w:bookmarkEnd w:id="17"/>
+      <w:bookmarkEnd w:id="18"/>
     </w:p>
     <w:p>
       <w:r>
@@ -2369,14 +2380,12 @@
       <w:pPr>
         <w:pStyle w:val="Heading1"/>
       </w:pPr>
-      <w:bookmarkStart w:id="18" w:name="_Toc173861352"/>
-      <w:bookmarkStart w:id="19" w:name="_GoBack"/>
-      <w:bookmarkEnd w:id="19"/>
+      <w:bookmarkStart w:id="19" w:name="_Toc174702245"/>
       <w:r>
         <w:lastRenderedPageBreak/>
         <w:t>System Verification with Proteus Simulation</w:t>
       </w:r>
-      <w:bookmarkEnd w:id="18"/>
+      <w:bookmarkEnd w:id="19"/>
     </w:p>
     <w:p>
       <w:r>
@@ -2588,7 +2597,7 @@
       <w:rPr>
         <w:noProof/>
       </w:rPr>
-      <w:t>13</w:t>
+      <w:t>1</w:t>
     </w:r>
     <w:r>
       <w:fldChar w:fldCharType="end"/>
@@ -5222,7 +5231,7 @@
 </file>
 
 <file path=customXml/itemProps1.xml><?xml version="1.0" encoding="utf-8"?>
-<ds:datastoreItem xmlns:ds="http://schemas.openxmlformats.org/officeDocument/2006/customXml" ds:itemID="{AE443FBA-2720-4645-A3C5-91EECE55798A}">
+<ds:datastoreItem xmlns:ds="http://schemas.openxmlformats.org/officeDocument/2006/customXml" ds:itemID="{DC08648B-A857-4B80-855C-2EA82F75CC3F}">
   <ds:schemaRefs>
     <ds:schemaRef ds:uri="http://schemas.openxmlformats.org/officeDocument/2006/bibliography"/>
   </ds:schemaRefs>

</xml_diff>